<commit_message>
Builder Review: autoDDPM, HippUnfold; concise EBM/sustain; site v43
- Tighter EBM and Jiang/SuStaIn markdown; regenerated docx
- Add autoDDPM and HippUnfold reviews (hipp_br, autoDDPM_br) and docx build
- Builder Review page: short tagline, four collapsibles, cache v43

Made-with: Cursor
</commit_message>
<xml_diff>
--- a/content/sustain_br.docx
+++ b/content/sustain_br.docx
@@ -43,7 +43,7 @@
         <w:pStyle w:val="FirstParagraph"/>
       </w:pPr>
       <w:r>
-        <w:t xml:space="preserve">Evaluation of the</w:t>
+        <w:t xml:space="preserve">Condensed look at the</w:t>
       </w:r>
       <w:r>
         <w:t xml:space="preserve"> </w:t>
@@ -58,7 +58,37 @@
         <w:t xml:space="preserve"> </w:t>
       </w:r>
       <w:r>
-        <w:t xml:space="preserve">study and what a builder can realistically reuse, using the same Inzira Labs Builder Review layers as in a full framework doc (usability, reproducibility, performance, generalization, clinical use, interpretability, integration, limitations, builder insight).</w:t>
+        <w:t xml:space="preserve">study: what a builder can realistically reuse. Layers:</w:t>
+      </w:r>
+      <w:r>
+        <w:t xml:space="preserve"> </w:t>
+      </w:r>
+      <w:r>
+        <w:rPr>
+          <w:b/>
+        </w:rPr>
+        <w:t xml:space="preserve">Can it run?</w:t>
+      </w:r>
+      <w:r>
+        <w:t xml:space="preserve"> </w:t>
+      </w:r>
+      <w:r>
+        <w:rPr>
+          <w:b/>
+        </w:rPr>
+        <w:t xml:space="preserve">Does it work?</w:t>
+      </w:r>
+      <w:r>
+        <w:t xml:space="preserve"> </w:t>
+      </w:r>
+      <w:r>
+        <w:rPr>
+          <w:b/>
+        </w:rPr>
+        <w:t xml:space="preserve">Can it be used?</w:t>
+      </w:r>
+      <w:r>
+        <w:t xml:space="preserve">—plus limitations and takeaway.</w:t>
       </w:r>
     </w:p>
     <w:p>
@@ -98,799 +128,18 @@
         <w:rPr>
           <w:b/>
         </w:rPr>
-        <w:t xml:space="preserve">Local kit:</w:t>
-      </w:r>
-      <w:r>
-        <w:t xml:space="preserve"> </w:t>
-      </w:r>
-      <w:r>
-        <w:t xml:space="preserve">this repository (</w:t>
-      </w:r>
-      <w:r>
-        <w:rPr>
-          <w:rStyle w:val="VerbatimChar"/>
-        </w:rPr>
-        <w:t xml:space="preserve">JIANG_2024_REPLICATION.md</w:t>
-      </w:r>
-      <w:r>
-        <w:t xml:space="preserve">,</w:t>
-      </w:r>
-      <w:r>
-        <w:t xml:space="preserve"> </w:t>
-      </w:r>
-      <w:r>
-        <w:rPr>
-          <w:rStyle w:val="VerbatimChar"/>
-        </w:rPr>
-        <w:t xml:space="preserve">implement/</w:t>
-      </w:r>
-      <w:r>
-        <w:t xml:space="preserve">,</w:t>
-      </w:r>
-      <w:r>
-        <w:t xml:space="preserve"> </w:t>
-      </w:r>
-      <w:r>
-        <w:rPr>
-          <w:rStyle w:val="VerbatimChar"/>
-        </w:rPr>
-        <w:t xml:space="preserve">vendor/pySuStaIn/</w:t>
-      </w:r>
-      <w:r>
-        <w:t xml:space="preserve">,</w:t>
-      </w:r>
-      <w:r>
-        <w:t xml:space="preserve"> </w:t>
-      </w:r>
-      <w:r>
-        <w:rPr>
-          <w:rStyle w:val="VerbatimChar"/>
-        </w:rPr>
-        <w:t xml:space="preserve">data/public_supplementary/</w:t>
-      </w:r>
-      <w:r>
-        <w:t xml:space="preserve"> </w:t>
-      </w:r>
-      <w:r>
-        <w:t xml:space="preserve">after download).</w:t>
-      </w:r>
-    </w:p>
-    <w:p>
-      <w:r>
-        <w:pict>
-          <v:rect style="width:0;height:1.5pt" o:hralign="center" o:hrstd="t" o:hr="t"/>
-        </w:pict>
-      </w:r>
-    </w:p>
-    <w:p>
-      <w:pPr>
-        <w:pStyle w:val="Heading1"/>
-      </w:pPr>
-      <w:bookmarkStart w:id="21" w:name="context"/>
-      <w:r>
-        <w:t xml:space="preserve">Context</w:t>
-      </w:r>
-      <w:bookmarkEnd w:id="21"/>
-    </w:p>
-    <w:p>
-      <w:pPr>
-        <w:pStyle w:val="FirstParagraph"/>
-      </w:pPr>
-      <w:r>
-        <w:t xml:space="preserve">The paper identifies four MRI-derived biotypes in temporal lobe epilepsy using z-scored regional morphometry and Subtype and Stage Inference (SuStaIn), then links biotypes to clinical variables and prediction models. Raw imaging and subject-level feature matrices are not public; publisher Source Data spreadsheets support summary figures and tables.</w:t>
-      </w:r>
-    </w:p>
-    <w:p>
-      <w:r>
-        <w:pict>
-          <v:rect style="width:0;height:1.5pt" o:hralign="center" o:hrstd="t" o:hr="t"/>
-        </w:pict>
-      </w:r>
-    </w:p>
-    <w:p>
-      <w:pPr>
-        <w:pStyle w:val="Heading1"/>
-      </w:pPr>
-      <w:bookmarkStart w:id="22" w:name="layer-1-can-it-run"/>
-      <w:r>
-        <w:t xml:space="preserve">Layer 1 — Can it run?</w:t>
-      </w:r>
-      <w:bookmarkEnd w:id="22"/>
-    </w:p>
-    <w:p>
-      <w:pPr>
-        <w:pStyle w:val="Heading2"/>
-      </w:pPr>
-      <w:bookmarkStart w:id="23" w:name="usability"/>
-      <w:r>
-        <w:t xml:space="preserve">Usability</w:t>
-      </w:r>
-      <w:bookmarkEnd w:id="23"/>
-    </w:p>
-    <w:p>
-      <w:pPr>
-        <w:pStyle w:val="FirstParagraph"/>
-      </w:pPr>
-      <w:r>
-        <w:t xml:space="preserve">For the published work:</w:t>
-      </w:r>
-    </w:p>
-    <w:p>
-      <w:pPr>
-        <w:numPr>
-          <w:ilvl w:val="0"/>
-          <w:numId w:val="1001"/>
-        </w:numPr>
-        <w:pStyle w:val="Compact"/>
-      </w:pPr>
-      <w:r>
-        <w:t xml:space="preserve">Methods and hyperparameters are documented (FreeSurfer 6.0, ROI set, z thresholds 1–2–3, MCMC settings, CVIC).</w:t>
-      </w:r>
-    </w:p>
-    <w:p>
-      <w:pPr>
-        <w:numPr>
-          <w:ilvl w:val="0"/>
-          <w:numId w:val="1001"/>
-        </w:numPr>
-        <w:pStyle w:val="Compact"/>
-      </w:pPr>
-      <w:r>
-        <w:t xml:space="preserve">Supplementary PDFs and Source Data (MOESM) are available from the publisher.</w:t>
-      </w:r>
-    </w:p>
-    <w:p>
-      <w:pPr>
-        <w:pStyle w:val="FirstParagraph"/>
-      </w:pPr>
-      <w:r>
-        <w:t xml:space="preserve">For an independent builder:</w:t>
-      </w:r>
-    </w:p>
-    <w:p>
-      <w:pPr>
-        <w:numPr>
-          <w:ilvl w:val="0"/>
-          <w:numId w:val="1002"/>
-        </w:numPr>
-        <w:pStyle w:val="Compact"/>
-      </w:pPr>
-      <w:r>
-        <w:t xml:space="preserve">You must supply T1 MRI, run cortical/subcortical extraction, and build a comparable z-score matrix with your own controls.</w:t>
-      </w:r>
-    </w:p>
-    <w:p>
-      <w:pPr>
-        <w:numPr>
-          <w:ilvl w:val="0"/>
-          <w:numId w:val="1002"/>
-        </w:numPr>
-        <w:pStyle w:val="Compact"/>
-      </w:pPr>
-      <w:r>
-        <w:t xml:space="preserve">This repo adds a CLI (</w:t>
-      </w:r>
-      <w:r>
-        <w:rPr>
-          <w:rStyle w:val="VerbatimChar"/>
-        </w:rPr>
-        <w:t xml:space="preserve">./sustain</w:t>
-      </w:r>
-      <w:r>
-        <w:t xml:space="preserve">), Excel loaders, figure-style plots from Source Data, and a synthetic pySuStaIn demo—not a one-click replay of the full cohort.</w:t>
-      </w:r>
-    </w:p>
-    <w:p>
-      <w:pPr>
-        <w:pStyle w:val="FirstParagraph"/>
-      </w:pPr>
-      <w:r>
-        <w:t xml:space="preserve">However:</w:t>
-      </w:r>
-    </w:p>
-    <w:p>
-      <w:pPr>
-        <w:numPr>
-          <w:ilvl w:val="0"/>
-          <w:numId w:val="1003"/>
-        </w:numPr>
-        <w:pStyle w:val="Compact"/>
-      </w:pPr>
-      <w:r>
-        <w:t xml:space="preserve">End-to-end replication without raw data still leaves SuStaIn fitting and subtype assignment as a bring-your-own-features exercise.</w:t>
-      </w:r>
-    </w:p>
-    <w:p>
-      <w:pPr>
-        <w:numPr>
-          <w:ilvl w:val="0"/>
-          <w:numId w:val="1003"/>
-        </w:numPr>
-        <w:pStyle w:val="Compact"/>
-      </w:pPr>
-      <w:r>
-        <w:t xml:space="preserve">Tooling assumes Python skill, optional HPC, and FreeSurfer or equivalent outside this repo.</w:t>
-      </w:r>
-    </w:p>
-    <w:p>
-      <w:pPr>
-        <w:pStyle w:val="Heading2"/>
-      </w:pPr>
-      <w:bookmarkStart w:id="24" w:name="reproducibility"/>
-      <w:r>
-        <w:t xml:space="preserve">Reproducibility</w:t>
-      </w:r>
-      <w:bookmarkEnd w:id="24"/>
-    </w:p>
-    <w:p>
-      <w:pPr>
-        <w:pStyle w:val="FirstParagraph"/>
-      </w:pPr>
-      <w:r>
-        <w:t xml:space="preserve">What aligns with the paper without private data:</w:t>
-      </w:r>
-    </w:p>
-    <w:p>
-      <w:pPr>
-        <w:numPr>
-          <w:ilvl w:val="0"/>
-          <w:numId w:val="1004"/>
-        </w:numPr>
-        <w:pStyle w:val="Compact"/>
-      </w:pPr>
-      <w:r>
-        <w:t xml:space="preserve">Aggregate plots and tables driven from Source Data (e.g. Fig. 2–3–style summaries in predict_epi) can match published values when using the same spreadsheets.</w:t>
-      </w:r>
-    </w:p>
-    <w:p>
-      <w:pPr>
-        <w:pStyle w:val="FirstParagraph"/>
-      </w:pPr>
-      <w:r>
-        <w:t xml:space="preserve">What does not fully reproduce from supplements alone:</w:t>
-      </w:r>
-    </w:p>
-    <w:p>
-      <w:pPr>
-        <w:numPr>
-          <w:ilvl w:val="0"/>
-          <w:numId w:val="1005"/>
-        </w:numPr>
-        <w:pStyle w:val="Compact"/>
-      </w:pPr>
-      <w:r>
-        <w:t xml:space="preserve">Subject-level z-scores, SuStaIn MCMC chains, trajectory ordering, and individual biotype labels require the authors’ feature matrix or refitting on a new cohort.</w:t>
-      </w:r>
-    </w:p>
-    <w:p>
-      <w:pPr>
-        <w:numPr>
-          <w:ilvl w:val="0"/>
-          <w:numId w:val="1005"/>
-        </w:numPr>
-        <w:pStyle w:val="Compact"/>
-      </w:pPr>
-      <w:r>
-        <w:t xml:space="preserve">Downstream classifiers (e.g. SVM + PCA) inherit the same data boundary: labels and features must be reconstructed locally.</w:t>
-      </w:r>
-    </w:p>
-    <w:p>
-      <w:pPr>
-        <w:pStyle w:val="FirstParagraph"/>
-      </w:pPr>
-      <w:r>
-        <w:t xml:space="preserve">Observed:</w:t>
-      </w:r>
-    </w:p>
-    <w:p>
-      <w:pPr>
-        <w:numPr>
-          <w:ilvl w:val="0"/>
-          <w:numId w:val="1006"/>
-        </w:numPr>
-        <w:pStyle w:val="Compact"/>
-      </w:pPr>
-      <w:r>
-        <w:t xml:space="preserve">Sensitivity to random starts (25), MCMC length, and control-sample regression is expected; the paper reports robustness checks in supplementary material.</w:t>
-      </w:r>
-    </w:p>
-    <w:p>
-      <w:pPr>
-        <w:numPr>
-          <w:ilvl w:val="0"/>
-          <w:numId w:val="1006"/>
-        </w:numPr>
-        <w:pStyle w:val="Compact"/>
-      </w:pPr>
-      <w:r>
-        <w:t xml:space="preserve">Any new site must re-derive z-scores; thresholds are not automatically transferable without harmonization.</w:t>
-      </w:r>
-    </w:p>
-    <w:p>
-      <w:r>
-        <w:pict>
-          <v:rect style="width:0;height:1.5pt" o:hralign="center" o:hrstd="t" o:hr="t"/>
-        </w:pict>
-      </w:r>
-    </w:p>
-    <w:p>
-      <w:pPr>
-        <w:pStyle w:val="Heading2"/>
-      </w:pPr>
-      <w:bookmarkStart w:id="25" w:name="layer-2-does-it-work"/>
-      <w:r>
-        <w:t xml:space="preserve">Layer 2 — Does it work?</w:t>
-      </w:r>
-      <w:bookmarkEnd w:id="25"/>
-    </w:p>
-    <w:p>
-      <w:pPr>
-        <w:pStyle w:val="Heading3"/>
-      </w:pPr>
-      <w:bookmarkStart w:id="26" w:name="performance"/>
-      <w:r>
-        <w:t xml:space="preserve">Performance</w:t>
-      </w:r>
-      <w:bookmarkEnd w:id="26"/>
-    </w:p>
-    <w:p>
-      <w:pPr>
-        <w:pStyle w:val="FirstParagraph"/>
-      </w:pPr>
-      <w:r>
-        <w:t xml:space="preserve">The paper reports group separations, associations with clinical variables, and prediction metrics on their cohort. Those numbers are tied to their preprocessing and population.</w:t>
-      </w:r>
-    </w:p>
-    <w:p>
-      <w:pPr>
-        <w:pStyle w:val="BodyText"/>
-      </w:pPr>
-      <w:r>
-        <w:t xml:space="preserve">Observed for an external builder:</w:t>
-      </w:r>
-    </w:p>
-    <w:p>
-      <w:pPr>
-        <w:numPr>
-          <w:ilvl w:val="0"/>
-          <w:numId w:val="1007"/>
-        </w:numPr>
-        <w:pStyle w:val="Compact"/>
-      </w:pPr>
-      <w:r>
-        <w:t xml:space="preserve">You should expect to validate de novo on your data; performance should not be assumed to port.</w:t>
-      </w:r>
-    </w:p>
-    <w:p>
-      <w:pPr>
-        <w:numPr>
-          <w:ilvl w:val="0"/>
-          <w:numId w:val="1007"/>
-        </w:numPr>
-        <w:pStyle w:val="Compact"/>
-      </w:pPr>
-      <w:r>
-        <w:t xml:space="preserve">The bundled synthetic SuStaIn run only exercises the Z-score / piecewise model class—it does not benchmark against the paper’s metrics.</w:t>
-      </w:r>
-    </w:p>
-    <w:p>
-      <w:pPr>
-        <w:pStyle w:val="Heading2"/>
-      </w:pPr>
-      <w:bookmarkStart w:id="27" w:name="generalization"/>
-      <w:r>
-        <w:t xml:space="preserve">Generalization</w:t>
-      </w:r>
-      <w:bookmarkEnd w:id="27"/>
-    </w:p>
-    <w:p>
-      <w:pPr>
-        <w:pStyle w:val="FirstParagraph"/>
-      </w:pPr>
-      <w:r>
-        <w:t xml:space="preserve">Cross-scanner, cross-site, and pediatric or mixed-epilepsy populations are not established by the single-cohort study.</w:t>
-      </w:r>
-    </w:p>
-    <w:p>
-      <w:pPr>
-        <w:numPr>
-          <w:ilvl w:val="0"/>
-          <w:numId w:val="1008"/>
-        </w:numPr>
-        <w:pStyle w:val="Compact"/>
-      </w:pPr>
-      <w:r>
-        <w:t xml:space="preserve">SuStaIn subtypes are defined relative to the normative model and ROI set; changing atlas, software version, or covariate regression changes the latent space.</w:t>
-      </w:r>
-    </w:p>
-    <w:p>
-      <w:pPr>
-        <w:numPr>
-          <w:ilvl w:val="0"/>
-          <w:numId w:val="1008"/>
-        </w:numPr>
-        <w:pStyle w:val="Compact"/>
-      </w:pPr>
-      <w:r>
-        <w:t xml:space="preserve">There is no public pretrained SuStaIn pickle that assigns new patients to the authors’ four biotypes out of the box.</w:t>
-      </w:r>
-    </w:p>
-    <w:p>
-      <w:r>
-        <w:pict>
-          <v:rect style="width:0;height:1.5pt" o:hralign="center" o:hrstd="t" o:hr="t"/>
-        </w:pict>
-      </w:r>
-    </w:p>
-    <w:p>
-      <w:pPr>
-        <w:pStyle w:val="Heading1"/>
-      </w:pPr>
-      <w:bookmarkStart w:id="28" w:name="layer-3-can-it-be-used"/>
-      <w:r>
-        <w:t xml:space="preserve">Layer 3 — Can it be used?</w:t>
-      </w:r>
-      <w:bookmarkEnd w:id="28"/>
-    </w:p>
-    <w:p>
-      <w:pPr>
-        <w:pStyle w:val="Heading2"/>
-      </w:pPr>
-      <w:bookmarkStart w:id="29" w:name="clinical-relevance"/>
-      <w:r>
-        <w:t xml:space="preserve">Clinical relevance</w:t>
-      </w:r>
-      <w:bookmarkEnd w:id="29"/>
-    </w:p>
-    <w:p>
-      <w:pPr>
-        <w:numPr>
-          <w:ilvl w:val="0"/>
-          <w:numId w:val="1009"/>
-        </w:numPr>
-        <w:pStyle w:val="Compact"/>
-      </w:pPr>
-      <w:r>
-        <w:t xml:space="preserve">Biotypes plus stages could enrich stratification and trial design if validated locally.</w:t>
-      </w:r>
-    </w:p>
-    <w:p>
-      <w:pPr>
-        <w:numPr>
-          <w:ilvl w:val="0"/>
-          <w:numId w:val="1009"/>
-        </w:numPr>
-        <w:pStyle w:val="Compact"/>
-      </w:pPr>
-      <w:r>
-        <w:t xml:space="preserve">Workflow gap: routine clinical MRI pipelines rarely output the exact ROI z-score table SuStaIn expects; research-grade preprocessing is still a prerequisite.</w:t>
-      </w:r>
-    </w:p>
-    <w:p>
-      <w:pPr>
-        <w:numPr>
-          <w:ilvl w:val="0"/>
-          <w:numId w:val="1009"/>
-        </w:numPr>
-        <w:pStyle w:val="Compact"/>
-      </w:pPr>
-      <w:r>
-        <w:t xml:space="preserve">Regulatory and deployment paths (CADx-style use) are not addressed in the paper and would need separate evidence.</w:t>
-      </w:r>
-    </w:p>
-    <w:p>
-      <w:pPr>
-        <w:pStyle w:val="Heading2"/>
-      </w:pPr>
-      <w:bookmarkStart w:id="30" w:name="interpretability-and-trust"/>
-      <w:r>
-        <w:t xml:space="preserve">Interpretability and trust</w:t>
-      </w:r>
-      <w:bookmarkEnd w:id="30"/>
-    </w:p>
-    <w:p>
-      <w:pPr>
-        <w:numPr>
-          <w:ilvl w:val="0"/>
-          <w:numId w:val="1010"/>
-        </w:numPr>
-        <w:pStyle w:val="Compact"/>
-      </w:pPr>
-      <w:r>
-        <w:t xml:space="preserve">SuStaIn outputs are interpretable at the level of ordered ROI events and subtype means, which is stronger than a black-box embedding alone.</w:t>
-      </w:r>
-    </w:p>
-    <w:p>
-      <w:pPr>
-        <w:numPr>
-          <w:ilvl w:val="0"/>
-          <w:numId w:val="1010"/>
-        </w:numPr>
-        <w:pStyle w:val="Compact"/>
-      </w:pPr>
-      <w:r>
-        <w:t xml:space="preserve">Trust still depends on QC of FreeSurfer outputs, motion, and segmentation failures—failure modes may concentrate in specific biotypes.</w:t>
-      </w:r>
-    </w:p>
-    <w:p>
-      <w:pPr>
-        <w:pStyle w:val="Heading2"/>
-      </w:pPr>
-      <w:bookmarkStart w:id="31" w:name="integration-potential"/>
-      <w:r>
-        <w:t xml:space="preserve">Integration potential</w:t>
-      </w:r>
-      <w:bookmarkEnd w:id="31"/>
-    </w:p>
-    <w:p>
-      <w:pPr>
-        <w:numPr>
-          <w:ilvl w:val="0"/>
-          <w:numId w:val="1011"/>
-        </w:numPr>
-        <w:pStyle w:val="Compact"/>
-      </w:pPr>
-      <w:r>
-        <w:t xml:space="preserve">Research integration: pySuStaIn, ENIGMA-style visualization, and BIDS-oriented preprocessing stacks (e.g. containerized neuroimaging environments) are natural adjacent layers.</w:t>
-      </w:r>
-    </w:p>
-    <w:p>
-      <w:pPr>
-        <w:numPr>
-          <w:ilvl w:val="0"/>
-          <w:numId w:val="1011"/>
-        </w:numPr>
-        <w:pStyle w:val="Compact"/>
-      </w:pPr>
-      <w:r>
-        <w:t xml:space="preserve">Clinical integration: would require DICOM → structured morphometry → QC → SuStaIn → reporting; none of that is turnkey in supplementary files alone.</w:t>
-      </w:r>
-    </w:p>
-    <w:p>
-      <w:r>
-        <w:pict>
-          <v:rect style="width:0;height:1.5pt" o:hralign="center" o:hrstd="t" o:hr="t"/>
-        </w:pict>
-      </w:r>
-    </w:p>
-    <w:p>
-      <w:pPr>
-        <w:pStyle w:val="Heading1"/>
-      </w:pPr>
-      <w:bookmarkStart w:id="32" w:name="limitations-and-failure-modes"/>
-      <w:r>
-        <w:t xml:space="preserve">Limitations and failure modes</w:t>
-      </w:r>
-      <w:bookmarkEnd w:id="32"/>
-    </w:p>
-    <w:p>
-      <w:pPr>
-        <w:numPr>
-          <w:ilvl w:val="0"/>
-          <w:numId w:val="1012"/>
-        </w:numPr>
-        <w:pStyle w:val="Compact"/>
-      </w:pPr>
-      <w:r>
-        <w:t xml:space="preserve">Private imaging and features block exact numerical replication of SuStaIn fits.</w:t>
-      </w:r>
-    </w:p>
-    <w:p>
-      <w:pPr>
-        <w:numPr>
-          <w:ilvl w:val="0"/>
-          <w:numId w:val="1012"/>
-        </w:numPr>
-        <w:pStyle w:val="Compact"/>
-      </w:pPr>
-      <w:r>
-        <w:t xml:space="preserve">Subtype count selection (CVIC) and trajectory structure can shift with cohort composition.</w:t>
-      </w:r>
-    </w:p>
-    <w:p>
-      <w:pPr>
-        <w:numPr>
-          <w:ilvl w:val="0"/>
-          <w:numId w:val="1012"/>
-        </w:numPr>
-        <w:pStyle w:val="Compact"/>
-      </w:pPr>
-      <w:r>
-        <w:t xml:space="preserve">Class imbalance, comorbidities, and surgical candidacy may distort apparent biotype–outcome relationships if not modeled.</w:t>
-      </w:r>
-    </w:p>
-    <w:p>
-      <w:pPr>
-        <w:numPr>
-          <w:ilvl w:val="0"/>
-          <w:numId w:val="1012"/>
-        </w:numPr>
-        <w:pStyle w:val="Compact"/>
-      </w:pPr>
-      <w:r>
-        <w:t xml:space="preserve">The local demo uses synthetic data; it must not be mistaken for empirical results.</w:t>
-      </w:r>
-    </w:p>
-    <w:p>
-      <w:r>
-        <w:pict>
-          <v:rect style="width:0;height:1.5pt" o:hralign="center" o:hrstd="t" o:hr="t"/>
-        </w:pict>
-      </w:r>
-    </w:p>
-    <w:p>
-      <w:pPr>
-        <w:pStyle w:val="Heading1"/>
-      </w:pPr>
-      <w:bookmarkStart w:id="33" w:name="builder-insight"/>
-      <w:r>
-        <w:t xml:space="preserve">Builder insight</w:t>
-      </w:r>
-      <w:bookmarkEnd w:id="33"/>
-    </w:p>
-    <w:p>
-      <w:pPr>
-        <w:pStyle w:val="FirstParagraph"/>
-      </w:pPr>
-      <w:r>
-        <w:t xml:space="preserve">The paper is strong on scientific framing and public summaries; the builder gap is the missing feature matrix and harmonization story for new sites. A practical path is: standardize preprocessing, mirror the ROI/covariate regression protocol, refit SuStaIn, then run prospective validation before any deployment narrative.</w:t>
-      </w:r>
-    </w:p>
-    <w:p>
-      <w:pPr>
-        <w:pStyle w:val="BodyText"/>
-      </w:pPr>
-      <w:r>
-        <w:t xml:space="preserve">Potential extensions:</w:t>
-      </w:r>
-    </w:p>
-    <w:p>
-      <w:pPr>
-        <w:numPr>
-          <w:ilvl w:val="0"/>
-          <w:numId w:val="1013"/>
-        </w:numPr>
-        <w:pStyle w:val="Compact"/>
-      </w:pPr>
-      <w:r>
-        <w:t xml:space="preserve">Share (where ethics allow) a minimal simulated dataset with the same schema as the real features, for pipeline testing only.</w:t>
-      </w:r>
-    </w:p>
-    <w:p>
-      <w:pPr>
-        <w:numPr>
-          <w:ilvl w:val="0"/>
-          <w:numId w:val="1013"/>
-        </w:numPr>
-        <w:pStyle w:val="Compact"/>
-      </w:pPr>
-      <w:r>
-        <w:t xml:space="preserve">Publish a reference Dockerfile/Apptainer recipe pinning FreeSurfer 6.0 and analysis library versions.</w:t>
-      </w:r>
-    </w:p>
-    <w:p>
-      <w:pPr>
-        <w:numPr>
-          <w:ilvl w:val="0"/>
-          <w:numId w:val="1013"/>
-        </w:numPr>
-        <w:pStyle w:val="Compact"/>
-      </w:pPr>
-      <w:r>
-        <w:t xml:space="preserve">Pre-register subtype stability analyses when applying the model to an external cohort.</w:t>
-      </w:r>
-    </w:p>
-    <w:p>
-      <w:r>
-        <w:pict>
-          <v:rect style="width:0;height:1.5pt" o:hralign="center" o:hrstd="t" o:hr="t"/>
-        </w:pict>
-      </w:r>
-    </w:p>
-    <w:p>
-      <w:pPr>
-        <w:pStyle w:val="Heading1"/>
-      </w:pPr>
-      <w:bookmarkStart w:id="34" w:name="references-selected"/>
-      <w:r>
-        <w:t xml:space="preserve">References (selected)</w:t>
-      </w:r>
-      <w:bookmarkEnd w:id="34"/>
-    </w:p>
-    <w:p>
-      <w:pPr>
-        <w:numPr>
-          <w:ilvl w:val="0"/>
-          <w:numId w:val="1014"/>
-        </w:numPr>
-        <w:pStyle w:val="Compact"/>
-      </w:pPr>
-      <w:r>
-        <w:t xml:space="preserve">Jiang et al. 2024 Nat Commun — primary TLE biotype paper (DOI above).</w:t>
-      </w:r>
-    </w:p>
-    <w:p>
-      <w:pPr>
-        <w:numPr>
-          <w:ilvl w:val="0"/>
-          <w:numId w:val="1014"/>
-        </w:numPr>
-        <w:pStyle w:val="Compact"/>
-      </w:pPr>
-      <w:r>
-        <w:t xml:space="preserve">Young et al. 2018 Nat Commun — SuStaIn methods foundation.</w:t>
-      </w:r>
-    </w:p>
-    <w:p>
-      <w:pPr>
-        <w:numPr>
-          <w:ilvl w:val="0"/>
-          <w:numId w:val="1014"/>
-        </w:numPr>
-        <w:pStyle w:val="Compact"/>
-      </w:pPr>
-      <w:r>
-        <w:rPr>
-          <w:rStyle w:val="VerbatimChar"/>
-        </w:rPr>
-        <w:t xml:space="preserve">JIANG_2024_REPLICATION.md</w:t>
-      </w:r>
-      <w:r>
-        <w:t xml:space="preserve"> </w:t>
-      </w:r>
-      <w:r>
-        <w:t xml:space="preserve">— replication kit notes and commands.</w:t>
-      </w:r>
-    </w:p>
-    <w:p>
-      <w:r>
-        <w:pict>
-          <v:rect style="width:0;height:1.5pt" o:hralign="center" o:hrstd="t" o:hr="t"/>
-        </w:pict>
-      </w:r>
-    </w:p>
-    <w:p>
-      <w:pPr>
-        <w:pStyle w:val="FirstParagraph"/>
-      </w:pPr>
-      <w:r>
-        <w:t xml:space="preserve">To refresh</w:t>
-      </w:r>
-      <w:r>
-        <w:t xml:space="preserve"> </w:t>
-      </w:r>
-      <w:r>
-        <w:rPr>
-          <w:rStyle w:val="VerbatimChar"/>
-          <w:b/>
-        </w:rPr>
-        <w:t xml:space="preserve">sustain_br.docx</w:t>
-      </w:r>
-      <w:r>
-        <w:t xml:space="preserve"> </w:t>
-      </w:r>
-      <w:r>
-        <w:t xml:space="preserve">locally after edits:</w:t>
-      </w:r>
-      <w:r>
-        <w:t xml:space="preserve"> </w:t>
-      </w:r>
-      <w:r>
-        <w:rPr>
-          <w:rStyle w:val="VerbatimChar"/>
-        </w:rPr>
-        <w:t xml:space="preserve">python3 scripts/render_sustain_br_docx.py</w:t>
-      </w:r>
-      <w:r>
-        <w:t xml:space="preserve"> </w:t>
-      </w:r>
-      <w:r>
-        <w:t xml:space="preserve">(from the</w:t>
-      </w:r>
-      <w:r>
-        <w:t xml:space="preserve"> </w:t>
-      </w:r>
-      <w:hyperlink r:id="rId35">
+        <w:t xml:space="preserve">Related work:</w:t>
+      </w:r>
+      <w:r>
+        <w:t xml:space="preserve"> </w:t>
+      </w:r>
+      <w:r>
+        <w:t xml:space="preserve">a replication-oriented kit lives in the</w:t>
+      </w:r>
+      <w:r>
+        <w:t xml:space="preserve"> </w:t>
+      </w:r>
+      <w:hyperlink r:id="rId21">
         <w:r>
           <w:rPr>
             <w:rStyle w:val="Hyperlink"/>
@@ -902,7 +151,141 @@
         <w:t xml:space="preserve"> </w:t>
       </w:r>
       <w:r>
-        <w:t xml:space="preserve">repo root). Word copies are not tracked on GitHub.</w:t>
+        <w:t xml:space="preserve">repo (</w:t>
+      </w:r>
+      <w:r>
+        <w:rPr>
+          <w:rStyle w:val="VerbatimChar"/>
+        </w:rPr>
+        <w:t xml:space="preserve">JIANG_2024_REPLICATION.md</w:t>
+      </w:r>
+      <w:r>
+        <w:t xml:space="preserve">,</w:t>
+      </w:r>
+      <w:r>
+        <w:t xml:space="preserve"> </w:t>
+      </w:r>
+      <w:r>
+        <w:rPr>
+          <w:rStyle w:val="VerbatimChar"/>
+        </w:rPr>
+        <w:t xml:space="preserve">implement/</w:t>
+      </w:r>
+      <w:r>
+        <w:t xml:space="preserve">,</w:t>
+      </w:r>
+      <w:r>
+        <w:t xml:space="preserve"> </w:t>
+      </w:r>
+      <w:r>
+        <w:rPr>
+          <w:rStyle w:val="VerbatimChar"/>
+        </w:rPr>
+        <w:t xml:space="preserve">vendor/pySuStaIn/</w:t>
+      </w:r>
+      <w:r>
+        <w:t xml:space="preserve">, public supplementary data where published).</w:t>
+      </w:r>
+    </w:p>
+    <w:p>
+      <w:r>
+        <w:pict>
+          <v:rect style="width:0;height:1.5pt" o:hralign="center" o:hrstd="t" o:hr="t"/>
+        </w:pict>
+      </w:r>
+    </w:p>
+    <w:p>
+      <w:pPr>
+        <w:pStyle w:val="Heading2"/>
+      </w:pPr>
+      <w:bookmarkStart w:id="22" w:name="context"/>
+      <w:r>
+        <w:t xml:space="preserve">Context</w:t>
+      </w:r>
+      <w:bookmarkEnd w:id="22"/>
+    </w:p>
+    <w:p>
+      <w:pPr>
+        <w:pStyle w:val="FirstParagraph"/>
+      </w:pPr>
+      <w:r>
+        <w:t xml:space="preserve">Four MRI-derived</w:t>
+      </w:r>
+      <w:r>
+        <w:t xml:space="preserve"> </w:t>
+      </w:r>
+      <w:r>
+        <w:rPr>
+          <w:b/>
+        </w:rPr>
+        <w:t xml:space="preserve">biotypes</w:t>
+      </w:r>
+      <w:r>
+        <w:t xml:space="preserve"> </w:t>
+      </w:r>
+      <w:r>
+        <w:t xml:space="preserve">in TLE via z-scored regional morphometry and</w:t>
+      </w:r>
+      <w:r>
+        <w:t xml:space="preserve"> </w:t>
+      </w:r>
+      <w:r>
+        <w:rPr>
+          <w:b/>
+        </w:rPr>
+        <w:t xml:space="preserve">SuStaIn</w:t>
+      </w:r>
+      <w:r>
+        <w:t xml:space="preserve">, linked to clinical variables and predictors.</w:t>
+      </w:r>
+      <w:r>
+        <w:t xml:space="preserve"> </w:t>
+      </w:r>
+      <w:r>
+        <w:rPr>
+          <w:b/>
+        </w:rPr>
+        <w:t xml:space="preserve">Raw imaging and subject-level feature matrices are not public;</w:t>
+      </w:r>
+      <w:r>
+        <w:t xml:space="preserve"> </w:t>
+      </w:r>
+      <w:r>
+        <w:t xml:space="preserve">Source Data support summary figures and tables.</w:t>
+      </w:r>
+    </w:p>
+    <w:p>
+      <w:r>
+        <w:pict>
+          <v:rect style="width:0;height:1.5pt" o:hralign="center" o:hrstd="t" o:hr="t"/>
+        </w:pict>
+      </w:r>
+    </w:p>
+    <w:p>
+      <w:pPr>
+        <w:pStyle w:val="Heading2"/>
+      </w:pPr>
+      <w:bookmarkStart w:id="23" w:name="can-it-run"/>
+      <w:r>
+        <w:t xml:space="preserve">Can it run?</w:t>
+      </w:r>
+      <w:bookmarkEnd w:id="23"/>
+    </w:p>
+    <w:p>
+      <w:pPr>
+        <w:pStyle w:val="FirstParagraph"/>
+      </w:pPr>
+      <w:r>
+        <w:rPr>
+          <w:b/>
+        </w:rPr>
+        <w:t xml:space="preserve">What the paper documents:</w:t>
+      </w:r>
+      <w:r>
+        <w:t xml:space="preserve"> </w:t>
+      </w:r>
+      <w:r>
+        <w:t xml:space="preserve">FreeSurfer 6.0, ROI set, z thresholds, MCMC, CVIC; supplements and Source Data on the publisher site.</w:t>
       </w:r>
     </w:p>
     <w:p>
@@ -911,9 +294,675 @@
       </w:pPr>
       <w:r>
         <w:rPr>
+          <w:b/>
+        </w:rPr>
+        <w:t xml:space="preserve">What you still bring:</w:t>
+      </w:r>
+      <w:r>
+        <w:t xml:space="preserve"> </w:t>
+      </w:r>
+      <w:r>
+        <w:t xml:space="preserve">T1 MRI → cortical/subcortical extraction → comparable z-score table with</w:t>
+      </w:r>
+      <w:r>
+        <w:t xml:space="preserve"> </w:t>
+      </w:r>
+      <w:r>
+        <w:rPr>
+          <w:b/>
+        </w:rPr>
+        <w:t xml:space="preserve">your</w:t>
+      </w:r>
+      <w:r>
+        <w:t xml:space="preserve"> </w:t>
+      </w:r>
+      <w:r>
+        <w:t xml:space="preserve">controls. The predict_epi kit adds a CLI, loaders, figure-style plots from Source Data, and a</w:t>
+      </w:r>
+      <w:r>
+        <w:t xml:space="preserve"> </w:t>
+      </w:r>
+      <w:r>
+        <w:rPr>
+          <w:b/>
+        </w:rPr>
+        <w:t xml:space="preserve">synthetic</w:t>
+      </w:r>
+      <w:r>
+        <w:t xml:space="preserve"> </w:t>
+      </w:r>
+      <w:r>
+        <w:t xml:space="preserve">SuStaIn demo—not a one-click full-cohort replay. Expect Python, optional HPC, and FreeSurfer (or equivalent)</w:t>
+      </w:r>
+      <w:r>
+        <w:t xml:space="preserve"> </w:t>
+      </w:r>
+      <w:r>
+        <w:rPr>
+          <w:b/>
+        </w:rPr>
+        <w:t xml:space="preserve">outside</w:t>
+      </w:r>
+      <w:r>
+        <w:t xml:space="preserve"> </w:t>
+      </w:r>
+      <w:r>
+        <w:t xml:space="preserve">a single repo.</w:t>
+      </w:r>
+    </w:p>
+    <w:p>
+      <w:pPr>
+        <w:pStyle w:val="BodyText"/>
+      </w:pPr>
+      <w:r>
+        <w:rPr>
+          <w:b/>
+        </w:rPr>
+        <w:t xml:space="preserve">Reproducibility without private data:</w:t>
+      </w:r>
+      <w:r>
+        <w:t xml:space="preserve"> </w:t>
+      </w:r>
+      <w:r>
+        <w:t xml:space="preserve">aggregate plots/tables from Source Data can match published values.</w:t>
+      </w:r>
+      <w:r>
+        <w:t xml:space="preserve"> </w:t>
+      </w:r>
+      <w:r>
+        <w:rPr>
+          <w:b/>
+        </w:rPr>
+        <w:t xml:space="preserve">Not</w:t>
+      </w:r>
+      <w:r>
+        <w:t xml:space="preserve"> </w:t>
+      </w:r>
+      <w:r>
+        <w:t xml:space="preserve">from supplements alone: subject z-scores, full MCMC chains, trajectory order, or individual biotype labels (need the authors’ matrix or refit on a new cohort). Classifiers (e.g. SVM + PCA) share that boundary. Sensitivity to random starts, MCMC length, and control regression is expected; new sites must re-derive z-scores and harmonize.</w:t>
+      </w:r>
+    </w:p>
+    <w:p>
+      <w:r>
+        <w:pict>
+          <v:rect style="width:0;height:1.5pt" o:hralign="center" o:hrstd="t" o:hr="t"/>
+        </w:pict>
+      </w:r>
+    </w:p>
+    <w:p>
+      <w:pPr>
+        <w:pStyle w:val="Heading2"/>
+      </w:pPr>
+      <w:bookmarkStart w:id="24" w:name="does-it-work-will-it-generalize"/>
+      <w:r>
+        <w:t xml:space="preserve">Does it work? Will it generalize?</w:t>
+      </w:r>
+      <w:bookmarkEnd w:id="24"/>
+    </w:p>
+    <w:p>
+      <w:pPr>
+        <w:numPr>
+          <w:ilvl w:val="0"/>
+          <w:numId w:val="1001"/>
+        </w:numPr>
+        <w:pStyle w:val="Compact"/>
+      </w:pPr>
+      <w:r>
+        <w:t xml:space="preserve">Reported metrics are</w:t>
+      </w:r>
+      <w:r>
+        <w:t xml:space="preserve"> </w:t>
+      </w:r>
+      <w:r>
+        <w:rPr>
+          <w:b/>
+        </w:rPr>
+        <w:t xml:space="preserve">tied to their preprocessing and cohort</w:t>
+      </w:r>
+      <w:r>
+        <w:t xml:space="preserve">—</w:t>
+      </w:r>
+      <w:r>
+        <w:rPr>
+          <w:b/>
+        </w:rPr>
+        <w:t xml:space="preserve">validate on your data</w:t>
+      </w:r>
+      <w:r>
+        <w:t xml:space="preserve">; do not assume portability.</w:t>
+      </w:r>
+    </w:p>
+    <w:p>
+      <w:pPr>
+        <w:numPr>
+          <w:ilvl w:val="0"/>
+          <w:numId w:val="1001"/>
+        </w:numPr>
+        <w:pStyle w:val="Compact"/>
+      </w:pPr>
+      <w:r>
+        <w:t xml:space="preserve">The bundled synthetic run only exercises the Z-score / piecewise</w:t>
+      </w:r>
+      <w:r>
+        <w:t xml:space="preserve"> </w:t>
+      </w:r>
+      <w:r>
+        <w:rPr>
+          <w:b/>
+        </w:rPr>
+        <w:t xml:space="preserve">model class</w:t>
+      </w:r>
+      <w:r>
+        <w:t xml:space="preserve">—not a benchmark against the paper’s full metrics.</w:t>
+      </w:r>
+    </w:p>
+    <w:p>
+      <w:pPr>
+        <w:numPr>
+          <w:ilvl w:val="0"/>
+          <w:numId w:val="1001"/>
+        </w:numPr>
+        <w:pStyle w:val="Compact"/>
+      </w:pPr>
+      <w:r>
+        <w:rPr>
+          <w:b/>
+        </w:rPr>
+        <w:t xml:space="preserve">Single-cohort</w:t>
+      </w:r>
+      <w:r>
+        <w:t xml:space="preserve"> </w:t>
+      </w:r>
+      <w:r>
+        <w:t xml:space="preserve">study: cross-scanner, cross-site, pediatric, or mixed populations not established. SuStaIn subtypes depend on the normative model and ROI set; atlas or software changes shift the space. There is</w:t>
+      </w:r>
+      <w:r>
+        <w:t xml:space="preserve"> </w:t>
+      </w:r>
+      <w:r>
+        <w:rPr>
+          <w:b/>
+        </w:rPr>
+        <w:t xml:space="preserve">no</w:t>
+      </w:r>
+      <w:r>
+        <w:t xml:space="preserve"> </w:t>
+      </w:r>
+      <w:r>
+        <w:t xml:space="preserve">public pretrained pickle that assigns to the authors’ four biotypes out of the box.</w:t>
+      </w:r>
+    </w:p>
+    <w:p>
+      <w:r>
+        <w:pict>
+          <v:rect style="width:0;height:1.5pt" o:hralign="center" o:hrstd="t" o:hr="t"/>
+        </w:pict>
+      </w:r>
+    </w:p>
+    <w:p>
+      <w:pPr>
+        <w:pStyle w:val="Heading2"/>
+      </w:pPr>
+      <w:bookmarkStart w:id="25" w:name="X9bd50c18f03a1da63b2ff359c08f3e9d6f8d6ef"/>
+      <w:r>
+        <w:t xml:space="preserve">Can it be used? (clinical / integration / trust)</w:t>
+      </w:r>
+      <w:bookmarkEnd w:id="25"/>
+    </w:p>
+    <w:p>
+      <w:pPr>
+        <w:numPr>
+          <w:ilvl w:val="0"/>
+          <w:numId w:val="1002"/>
+        </w:numPr>
+        <w:pStyle w:val="Compact"/>
+      </w:pPr>
+      <w:r>
+        <w:t xml:space="preserve">Biotypes and stages could support</w:t>
+      </w:r>
+      <w:r>
+        <w:t xml:space="preserve"> </w:t>
+      </w:r>
+      <w:r>
+        <w:rPr>
+          <w:b/>
+        </w:rPr>
+        <w:t xml:space="preserve">stratification and trial design</w:t>
+      </w:r>
+      <w:r>
+        <w:t xml:space="preserve"> </w:t>
+      </w:r>
+      <w:r>
+        <w:t xml:space="preserve">if validated locally—not a CADx or deployment story in the paper; regulation would need separate evidence.</w:t>
+      </w:r>
+    </w:p>
+    <w:p>
+      <w:pPr>
+        <w:numPr>
+          <w:ilvl w:val="0"/>
+          <w:numId w:val="1002"/>
+        </w:numPr>
+        <w:pStyle w:val="Compact"/>
+      </w:pPr>
+      <w:r>
+        <w:t xml:space="preserve">Routine clinical pipelines rarely output the exact</w:t>
+      </w:r>
+      <w:r>
+        <w:t xml:space="preserve"> </w:t>
+      </w:r>
+      <w:r>
+        <w:rPr>
+          <w:b/>
+        </w:rPr>
+        <w:t xml:space="preserve">ROI z-score</w:t>
+      </w:r>
+      <w:r>
+        <w:t xml:space="preserve"> </w:t>
+      </w:r>
+      <w:r>
+        <w:t xml:space="preserve">table SuStaIn needs;</w:t>
+      </w:r>
+      <w:r>
+        <w:t xml:space="preserve"> </w:t>
+      </w:r>
+      <w:r>
+        <w:rPr>
+          <w:b/>
+        </w:rPr>
+        <w:t xml:space="preserve">research-grade</w:t>
+      </w:r>
+      <w:r>
+        <w:t xml:space="preserve"> </w:t>
+      </w:r>
+      <w:r>
+        <w:t xml:space="preserve">preprocessing is still required.</w:t>
+      </w:r>
+    </w:p>
+    <w:p>
+      <w:pPr>
+        <w:numPr>
+          <w:ilvl w:val="0"/>
+          <w:numId w:val="1002"/>
+        </w:numPr>
+        <w:pStyle w:val="Compact"/>
+      </w:pPr>
+      <w:r>
+        <w:t xml:space="preserve">SuStaIn is relatively</w:t>
+      </w:r>
+      <w:r>
+        <w:t xml:space="preserve"> </w:t>
+      </w:r>
+      <w:r>
+        <w:rPr>
+          <w:b/>
+        </w:rPr>
+        <w:t xml:space="preserve">interpretable</w:t>
+      </w:r>
+      <w:r>
+        <w:t xml:space="preserve"> </w:t>
+      </w:r>
+      <w:r>
+        <w:t xml:space="preserve">(ordered ROI events, subtype means) vs. a black box;</w:t>
+      </w:r>
+      <w:r>
+        <w:t xml:space="preserve"> </w:t>
+      </w:r>
+      <w:r>
+        <w:rPr>
+          <w:b/>
+        </w:rPr>
+        <w:t xml:space="preserve">trust</w:t>
+      </w:r>
+      <w:r>
+        <w:t xml:space="preserve"> </w:t>
+      </w:r>
+      <w:r>
+        <w:t xml:space="preserve">still depends on FreeSurfer QC, motion, segmentation—failures can cluster by biotype.</w:t>
+      </w:r>
+    </w:p>
+    <w:p>
+      <w:pPr>
+        <w:numPr>
+          <w:ilvl w:val="0"/>
+          <w:numId w:val="1002"/>
+        </w:numPr>
+        <w:pStyle w:val="Compact"/>
+      </w:pPr>
+      <w:r>
+        <w:rPr>
+          <w:b/>
+        </w:rPr>
+        <w:t xml:space="preserve">Research fit:</w:t>
+      </w:r>
+      <w:r>
+        <w:t xml:space="preserve"> </w:t>
+      </w:r>
+      <w:r>
+        <w:t xml:space="preserve">pySuStaIn, ENIGMA-style viz, BIDS + containers.</w:t>
+      </w:r>
+      <w:r>
+        <w:t xml:space="preserve"> </w:t>
+      </w:r>
+      <w:r>
+        <w:rPr>
+          <w:b/>
+        </w:rPr>
+        <w:t xml:space="preserve">Clinical fit:</w:t>
+      </w:r>
+      <w:r>
+        <w:t xml:space="preserve"> </w:t>
+      </w:r>
+      <w:r>
+        <w:t xml:space="preserve">DICOM → morphometry → QC → SuStaIn → reporting is</w:t>
+      </w:r>
+      <w:r>
+        <w:t xml:space="preserve"> </w:t>
+      </w:r>
+      <w:r>
+        <w:rPr>
+          <w:b/>
+        </w:rPr>
+        <w:t xml:space="preserve">not</w:t>
+      </w:r>
+      <w:r>
+        <w:t xml:space="preserve"> </w:t>
+      </w:r>
+      <w:r>
+        <w:t xml:space="preserve">turnkey from supplements alone.</w:t>
+      </w:r>
+    </w:p>
+    <w:p>
+      <w:r>
+        <w:pict>
+          <v:rect style="width:0;height:1.5pt" o:hralign="center" o:hrstd="t" o:hr="t"/>
+        </w:pict>
+      </w:r>
+    </w:p>
+    <w:p>
+      <w:pPr>
+        <w:pStyle w:val="Heading2"/>
+      </w:pPr>
+      <w:bookmarkStart w:id="26" w:name="limitations"/>
+      <w:r>
+        <w:t xml:space="preserve">Limitations</w:t>
+      </w:r>
+      <w:bookmarkEnd w:id="26"/>
+    </w:p>
+    <w:p>
+      <w:pPr>
+        <w:numPr>
+          <w:ilvl w:val="0"/>
+          <w:numId w:val="1003"/>
+        </w:numPr>
+        <w:pStyle w:val="Compact"/>
+      </w:pPr>
+      <w:r>
+        <w:t xml:space="preserve">Private features block</w:t>
+      </w:r>
+      <w:r>
+        <w:t xml:space="preserve"> </w:t>
+      </w:r>
+      <w:r>
+        <w:rPr>
+          <w:b/>
+        </w:rPr>
+        <w:t xml:space="preserve">numerical</w:t>
+      </w:r>
+      <w:r>
+        <w:t xml:space="preserve"> </w:t>
+      </w:r>
+      <w:r>
+        <w:t xml:space="preserve">replication of the authors’ SuStaIn fits.</w:t>
+      </w:r>
+    </w:p>
+    <w:p>
+      <w:pPr>
+        <w:numPr>
+          <w:ilvl w:val="0"/>
+          <w:numId w:val="1003"/>
+        </w:numPr>
+        <w:pStyle w:val="Compact"/>
+      </w:pPr>
+      <w:r>
+        <w:rPr>
+          <w:b/>
+        </w:rPr>
+        <w:t xml:space="preserve">CVIC</w:t>
+      </w:r>
+      <w:r>
+        <w:t xml:space="preserve"> </w:t>
+      </w:r>
+      <w:r>
+        <w:t xml:space="preserve">and trajectory structure can shift with cohort composition.</w:t>
+      </w:r>
+    </w:p>
+    <w:p>
+      <w:pPr>
+        <w:numPr>
+          <w:ilvl w:val="0"/>
+          <w:numId w:val="1003"/>
+        </w:numPr>
+        <w:pStyle w:val="Compact"/>
+      </w:pPr>
+      <w:r>
+        <w:t xml:space="preserve">Imbalance, comorbidities, and surgical selection can distort biotype–outcome links if unmodeled.</w:t>
+      </w:r>
+    </w:p>
+    <w:p>
+      <w:pPr>
+        <w:numPr>
+          <w:ilvl w:val="0"/>
+          <w:numId w:val="1003"/>
+        </w:numPr>
+        <w:pStyle w:val="Compact"/>
+      </w:pPr>
+      <w:r>
+        <w:rPr>
+          <w:b/>
+        </w:rPr>
+        <w:t xml:space="preserve">Synthetic demo ≠ empirical</w:t>
+      </w:r>
+      <w:r>
+        <w:t xml:space="preserve"> </w:t>
+      </w:r>
+      <w:r>
+        <w:t xml:space="preserve">results.</w:t>
+      </w:r>
+    </w:p>
+    <w:p>
+      <w:r>
+        <w:pict>
+          <v:rect style="width:0;height:1.5pt" o:hralign="center" o:hrstd="t" o:hr="t"/>
+        </w:pict>
+      </w:r>
+    </w:p>
+    <w:p>
+      <w:pPr>
+        <w:pStyle w:val="Heading2"/>
+      </w:pPr>
+      <w:bookmarkStart w:id="27" w:name="builder-insight"/>
+      <w:r>
+        <w:t xml:space="preserve">Builder insight</w:t>
+      </w:r>
+      <w:bookmarkEnd w:id="27"/>
+    </w:p>
+    <w:p>
+      <w:pPr>
+        <w:pStyle w:val="FirstParagraph"/>
+      </w:pPr>
+      <w:r>
+        <w:t xml:space="preserve">Strong framing and public summaries; the</w:t>
+      </w:r>
+      <w:r>
+        <w:t xml:space="preserve"> </w:t>
+      </w:r>
+      <w:r>
+        <w:rPr>
+          <w:b/>
+        </w:rPr>
+        <w:t xml:space="preserve">practical gap</w:t>
+      </w:r>
+      <w:r>
+        <w:t xml:space="preserve"> </w:t>
+      </w:r>
+      <w:r>
+        <w:t xml:space="preserve">is the missing feature matrix and</w:t>
+      </w:r>
+      <w:r>
+        <w:t xml:space="preserve"> </w:t>
+      </w:r>
+      <w:r>
+        <w:rPr>
+          <w:b/>
+        </w:rPr>
+        <w:t xml:space="preserve">harmonization</w:t>
+      </w:r>
+      <w:r>
+        <w:t xml:space="preserve"> </w:t>
+      </w:r>
+      <w:r>
+        <w:t xml:space="preserve">for new sites. Reasonable path:</w:t>
+      </w:r>
+      <w:r>
+        <w:t xml:space="preserve"> </w:t>
+      </w:r>
+      <w:r>
+        <w:rPr>
+          <w:b/>
+        </w:rPr>
+        <w:t xml:space="preserve">standardize preprocessing</w:t>
+      </w:r>
+      <w:r>
+        <w:t xml:space="preserve">, mirror ROI/covariate regression,</w:t>
+      </w:r>
+      <w:r>
+        <w:t xml:space="preserve"> </w:t>
+      </w:r>
+      <w:r>
+        <w:rPr>
+          <w:b/>
+        </w:rPr>
+        <w:t xml:space="preserve">refit</w:t>
+      </w:r>
+      <w:r>
+        <w:t xml:space="preserve"> </w:t>
+      </w:r>
+      <w:r>
+        <w:t xml:space="preserve">SuStaIn, then</w:t>
+      </w:r>
+      <w:r>
+        <w:t xml:space="preserve"> </w:t>
+      </w:r>
+      <w:r>
+        <w:rPr>
+          <w:b/>
+        </w:rPr>
+        <w:t xml:space="preserve">prospective</w:t>
+      </w:r>
+      <w:r>
+        <w:t xml:space="preserve"> </w:t>
+      </w:r>
+      <w:r>
+        <w:t xml:space="preserve">validation before any deployment story.</w:t>
+      </w:r>
+    </w:p>
+    <w:p>
+      <w:pPr>
+        <w:pStyle w:val="BodyText"/>
+      </w:pPr>
+      <w:r>
+        <w:rPr>
           <w:i/>
         </w:rPr>
-        <w:t xml:space="preserve">Last updated: 2026-04-14.</w:t>
+        <w:t xml:space="preserve">Possible next steps (where useful):</w:t>
+      </w:r>
+      <w:r>
+        <w:t xml:space="preserve"> </w:t>
+      </w:r>
+      <w:r>
+        <w:t xml:space="preserve">minimal simulated data matching the feature schema; pinned FreeSurfer + analysis</w:t>
+      </w:r>
+      <w:r>
+        <w:t xml:space="preserve"> </w:t>
+      </w:r>
+      <w:r>
+        <w:rPr>
+          <w:b/>
+        </w:rPr>
+        <w:t xml:space="preserve">container</w:t>
+      </w:r>
+      <w:r>
+        <w:t xml:space="preserve"> </w:t>
+      </w:r>
+      <w:r>
+        <w:t xml:space="preserve">recipe; pre-registered</w:t>
+      </w:r>
+      <w:r>
+        <w:t xml:space="preserve"> </w:t>
+      </w:r>
+      <w:r>
+        <w:rPr>
+          <w:b/>
+        </w:rPr>
+        <w:t xml:space="preserve">stability</w:t>
+      </w:r>
+      <w:r>
+        <w:t xml:space="preserve"> </w:t>
+      </w:r>
+      <w:r>
+        <w:t xml:space="preserve">on external data.</w:t>
+      </w:r>
+    </w:p>
+    <w:p>
+      <w:r>
+        <w:pict>
+          <v:rect style="width:0;height:1.5pt" o:hralign="center" o:hrstd="t" o:hr="t"/>
+        </w:pict>
+      </w:r>
+    </w:p>
+    <w:p>
+      <w:pPr>
+        <w:pStyle w:val="Heading2"/>
+      </w:pPr>
+      <w:bookmarkStart w:id="28" w:name="references-selected"/>
+      <w:r>
+        <w:t xml:space="preserve">References (selected)</w:t>
+      </w:r>
+      <w:bookmarkEnd w:id="28"/>
+    </w:p>
+    <w:p>
+      <w:pPr>
+        <w:numPr>
+          <w:ilvl w:val="0"/>
+          <w:numId w:val="1004"/>
+        </w:numPr>
+        <w:pStyle w:val="Compact"/>
+      </w:pPr>
+      <w:r>
+        <w:t xml:space="preserve">Jiang et al. 2024 Nat Commun — TLE biotypes (DOI above).</w:t>
+      </w:r>
+    </w:p>
+    <w:p>
+      <w:pPr>
+        <w:numPr>
+          <w:ilvl w:val="0"/>
+          <w:numId w:val="1004"/>
+        </w:numPr>
+        <w:pStyle w:val="Compact"/>
+      </w:pPr>
+      <w:r>
+        <w:t xml:space="preserve">Young et al. 2018 Nat Commun — SuStaIn methods.</w:t>
+      </w:r>
+    </w:p>
+    <w:p>
+      <w:pPr>
+        <w:pStyle w:val="FirstParagraph"/>
+      </w:pPr>
+      <w:r>
+        <w:rPr>
+          <w:i/>
+        </w:rPr>
+        <w:t xml:space="preserve">Last updated: 2026-04-23.</w:t>
       </w:r>
     </w:p>
     <w:sectPr/>
@@ -1165,36 +1214,6 @@
     <w:abstractNumId w:val="991"/>
   </w:num>
   <w:num w:numId="1004">
-    <w:abstractNumId w:val="991"/>
-  </w:num>
-  <w:num w:numId="1005">
-    <w:abstractNumId w:val="991"/>
-  </w:num>
-  <w:num w:numId="1006">
-    <w:abstractNumId w:val="991"/>
-  </w:num>
-  <w:num w:numId="1007">
-    <w:abstractNumId w:val="991"/>
-  </w:num>
-  <w:num w:numId="1008">
-    <w:abstractNumId w:val="991"/>
-  </w:num>
-  <w:num w:numId="1009">
-    <w:abstractNumId w:val="991"/>
-  </w:num>
-  <w:num w:numId="1010">
-    <w:abstractNumId w:val="991"/>
-  </w:num>
-  <w:num w:numId="1011">
-    <w:abstractNumId w:val="991"/>
-  </w:num>
-  <w:num w:numId="1012">
-    <w:abstractNumId w:val="991"/>
-  </w:num>
-  <w:num w:numId="1013">
-    <w:abstractNumId w:val="991"/>
-  </w:num>
-  <w:num w:numId="1014">
     <w:abstractNumId w:val="991"/>
   </w:num>
 </w:numbering>

</xml_diff>